<commit_message>
data: more analysis and edited pdfs and ppts
</commit_message>
<xml_diff>
--- a/Schumacher Technical report.docx
+++ b/Schumacher Technical report.docx
@@ -215,7 +215,6 @@
                                       <w:calendar w:val="gregorian"/>
                                     </w:date>
                                   </w:sdtPr>
-                                  <w:sdtEndPr/>
                                   <w:sdtContent>
                                     <w:p>
                                       <w:pPr>
@@ -3531,7 +3530,6 @@
                                 <w:calendar w:val="gregorian"/>
                               </w:date>
                             </w:sdtPr>
-                            <w:sdtEndPr/>
                             <w:sdtContent>
                               <w:p>
                                 <w:pPr>
@@ -3756,7 +3754,6 @@
                                     <w:dataBinding w:prefixMappings="xmlns:ns0='http://purl.org/dc/elements/1.1/' xmlns:ns1='http://schemas.openxmlformats.org/package/2006/metadata/core-properties' " w:xpath="/ns1:coreProperties[1]/ns0:creator[1]" w:storeItemID="{6C3C8BC8-F283-45AE-878A-BAB7291924A1}"/>
                                     <w:text/>
                                   </w:sdtPr>
-                                  <w:sdtEndPr/>
                                   <w:sdtContent>
                                     <w:r>
                                       <w:rPr>
@@ -3788,7 +3785,6 @@
                                     <w:dataBinding w:prefixMappings="xmlns:ns0='http://schemas.openxmlformats.org/officeDocument/2006/extended-properties' " w:xpath="/ns0:Properties[1]/ns0:Company[1]" w:storeItemID="{6668398D-A668-4E3E-A5EB-62B293D839F1}"/>
                                     <w:text/>
                                   </w:sdtPr>
-                                  <w:sdtEndPr/>
                                   <w:sdtContent>
                                     <w:r>
                                       <w:rPr>
@@ -3851,7 +3847,6 @@
                               <w:dataBinding w:prefixMappings="xmlns:ns0='http://purl.org/dc/elements/1.1/' xmlns:ns1='http://schemas.openxmlformats.org/package/2006/metadata/core-properties' " w:xpath="/ns1:coreProperties[1]/ns0:creator[1]" w:storeItemID="{6C3C8BC8-F283-45AE-878A-BAB7291924A1}"/>
                               <w:text/>
                             </w:sdtPr>
-                            <w:sdtEndPr/>
                             <w:sdtContent>
                               <w:r>
                                 <w:rPr>
@@ -3883,7 +3878,6 @@
                               <w:dataBinding w:prefixMappings="xmlns:ns0='http://schemas.openxmlformats.org/officeDocument/2006/extended-properties' " w:xpath="/ns0:Properties[1]/ns0:Company[1]" w:storeItemID="{6668398D-A668-4E3E-A5EB-62B293D839F1}"/>
                               <w:text/>
                             </w:sdtPr>
-                            <w:sdtEndPr/>
                             <w:sdtContent>
                               <w:r>
                                 <w:rPr>
@@ -3980,7 +3974,6 @@
                                     <w:dataBinding w:prefixMappings="xmlns:ns0='http://purl.org/dc/elements/1.1/' xmlns:ns1='http://schemas.openxmlformats.org/package/2006/metadata/core-properties' " w:xpath="/ns1:coreProperties[1]/ns0:title[1]" w:storeItemID="{6C3C8BC8-F283-45AE-878A-BAB7291924A1}"/>
                                     <w:text/>
                                   </w:sdtPr>
-                                  <w:sdtEndPr/>
                                   <w:sdtContent>
                                     <w:r>
                                       <w:rPr>
@@ -4042,7 +4035,6 @@
                               <w:dataBinding w:prefixMappings="xmlns:ns0='http://purl.org/dc/elements/1.1/' xmlns:ns1='http://schemas.openxmlformats.org/package/2006/metadata/core-properties' " w:xpath="/ns1:coreProperties[1]/ns0:title[1]" w:storeItemID="{6C3C8BC8-F283-45AE-878A-BAB7291924A1}"/>
                               <w:text/>
                             </w:sdtPr>
-                            <w:sdtEndPr/>
                             <w:sdtContent>
                               <w:r>
                                 <w:rPr>
@@ -12008,7 +12000,7 @@
           <w:color w:val="D4D4D4"/>
           <w:sz w:val="18"/>
           <w:szCs w:val="21"/>
-          <w:lang w:eastAsia="it-IT"/>
+          <w:lang w:val="en-IN" w:eastAsia="it-IT"/>
         </w:rPr>
       </w:pPr>
       <w:r>
@@ -12017,53 +12009,9 @@
           <w:color w:val="6A9955"/>
           <w:sz w:val="18"/>
           <w:szCs w:val="21"/>
-          <w:lang w:eastAsia="it-IT"/>
-        </w:rPr>
-        <w:t xml:space="preserve"># </w:t>
-      </w:r>
-      <w:proofErr w:type="spellStart"/>
-      <w:r>
-        <w:rPr>
-          <w:rFonts w:ascii="Consolas" w:eastAsia="Times New Roman" w:hAnsi="Consolas" w:cs="Times New Roman"/>
-          <w:color w:val="6A9955"/>
-          <w:sz w:val="18"/>
-          <w:szCs w:val="21"/>
-          <w:lang w:eastAsia="it-IT"/>
-        </w:rPr>
-        <w:t>Sanity</w:t>
-      </w:r>
-      <w:proofErr w:type="spellEnd"/>
-      <w:r>
-        <w:rPr>
-          <w:rFonts w:ascii="Consolas" w:eastAsia="Times New Roman" w:hAnsi="Consolas" w:cs="Times New Roman"/>
-          <w:color w:val="6A9955"/>
-          <w:sz w:val="18"/>
-          <w:szCs w:val="21"/>
-          <w:lang w:eastAsia="it-IT"/>
-        </w:rPr>
-        <w:t xml:space="preserve"> </w:t>
-      </w:r>
-      <w:proofErr w:type="spellStart"/>
-      <w:r>
-        <w:rPr>
-          <w:rFonts w:ascii="Consolas" w:eastAsia="Times New Roman" w:hAnsi="Consolas" w:cs="Times New Roman"/>
-          <w:color w:val="6A9955"/>
-          <w:sz w:val="18"/>
-          <w:szCs w:val="21"/>
-          <w:lang w:eastAsia="it-IT"/>
-        </w:rPr>
-        <w:t>checks</w:t>
-      </w:r>
-      <w:proofErr w:type="spellEnd"/>
-      <w:r>
-        <w:rPr>
-          <w:rFonts w:ascii="Consolas" w:eastAsia="Times New Roman" w:hAnsi="Consolas" w:cs="Times New Roman"/>
-          <w:color w:val="6A9955"/>
-          <w:sz w:val="18"/>
-          <w:szCs w:val="21"/>
-          <w:lang w:eastAsia="it-IT"/>
-        </w:rPr>
-        <w:t xml:space="preserve"> </w:t>
+          <w:lang w:val="en-IN" w:eastAsia="it-IT"/>
+        </w:rPr>
+        <w:t xml:space="preserve"># Sanity checks </w:t>
       </w:r>
     </w:p>
     <w:p>
@@ -21265,22 +21213,22 @@
       <w:bookmarkStart w:id="19" w:name="_Toc223365924"/>
       <w:r>
         <w:rPr>
-          <w:rFonts w:hAnsi="Symbol"/>
           <w:noProof/>
+          <w:lang w:val="en-IN"/>
         </w:rPr>
         <w:drawing>
-          <wp:anchor distT="0" distB="0" distL="114300" distR="114300" simplePos="0" relativeHeight="251665408" behindDoc="0" locked="0" layoutInCell="1" allowOverlap="1" wp14:anchorId="09BC813D" wp14:editId="4BDE6A6E">
+          <wp:anchor distT="0" distB="0" distL="114300" distR="114300" simplePos="0" relativeHeight="251675648" behindDoc="0" locked="0" layoutInCell="1" allowOverlap="1" wp14:anchorId="3BB6796B" wp14:editId="4D50A1F3">
             <wp:simplePos x="0" y="0"/>
             <wp:positionH relativeFrom="column">
-              <wp:posOffset>917271</wp:posOffset>
+              <wp:posOffset>2744031</wp:posOffset>
             </wp:positionH>
             <wp:positionV relativeFrom="paragraph">
-              <wp:posOffset>415290</wp:posOffset>
+              <wp:posOffset>456809</wp:posOffset>
             </wp:positionV>
-            <wp:extent cx="4555490" cy="3519170"/>
-            <wp:effectExtent l="0" t="0" r="0" b="5080"/>
-            <wp:wrapTopAndBottom/>
-            <wp:docPr id="38" name="Immagine 38"/>
+            <wp:extent cx="3850489" cy="1910862"/>
+            <wp:effectExtent l="0" t="0" r="0" b="0"/>
+            <wp:wrapNone/>
+            <wp:docPr id="37" name="Immagine 37"/>
             <wp:cNvGraphicFramePr>
               <a:graphicFrameLocks xmlns:a="http://schemas.openxmlformats.org/drawingml/2006/main" noChangeAspect="1"/>
             </wp:cNvGraphicFramePr>
@@ -21288,11 +21236,11 @@
               <a:graphicData uri="http://schemas.openxmlformats.org/drawingml/2006/picture">
                 <pic:pic xmlns:pic="http://schemas.openxmlformats.org/drawingml/2006/picture">
                   <pic:nvPicPr>
-                    <pic:cNvPr id="38" name="sampling intensity.png"/>
+                    <pic:cNvPr id="37" name="sample intensity.png"/>
                     <pic:cNvPicPr/>
                   </pic:nvPicPr>
                   <pic:blipFill>
-                    <a:blip r:embed="rId14">
+                    <a:blip r:embed="rId14" cstate="print">
                       <a:extLst>
                         <a:ext uri="{28A0092B-C50C-407E-A947-70E740481C1C}">
                           <a14:useLocalDpi xmlns:a14="http://schemas.microsoft.com/office/drawing/2010/main" val="0"/>
@@ -21306,7 +21254,7 @@
                   <pic:spPr>
                     <a:xfrm>
                       <a:off x="0" y="0"/>
-                      <a:ext cx="4555490" cy="3519170"/>
+                      <a:ext cx="3850489" cy="1910862"/>
                     </a:xfrm>
                     <a:prstGeom prst="rect">
                       <a:avLst/>
@@ -21326,262 +21274,22 @@
       </w:r>
       <w:r>
         <w:rPr>
-          <w:lang w:val="en-IN"/>
-        </w:rPr>
-        <w:t>4.2 SAMPLING INTENSITY</w:t>
-      </w:r>
-      <w:bookmarkEnd w:id="19"/>
-    </w:p>
-    <w:p>
-      <w:pPr>
-        <w:pStyle w:val="NormaleWeb"/>
-        <w:spacing w:line="276" w:lineRule="auto"/>
-        <w:rPr>
           <w:rFonts w:hAnsi="Symbol"/>
-          <w:lang w:val="en-IN"/>
-        </w:rPr>
-      </w:pPr>
-    </w:p>
-    <w:p>
-      <w:pPr>
-        <w:pStyle w:val="NormaleWeb"/>
-        <w:spacing w:line="276" w:lineRule="auto"/>
-        <w:rPr>
-          <w:lang w:val="en-IN"/>
-        </w:rPr>
-      </w:pPr>
-      <w:r>
-        <w:rPr>
-          <w:rFonts w:hAnsi="Symbol"/>
-        </w:rPr>
-        <w:t></w:t>
-      </w:r>
-      <w:r>
-        <w:rPr>
-          <w:lang w:val="en-IN"/>
-        </w:rPr>
-        <w:t xml:space="preserve"> </w:t>
-      </w:r>
-      <w:r>
-        <w:rPr>
-          <w:b/>
-          <w:lang w:val="en-IN"/>
-        </w:rPr>
-        <w:t>Average</w:t>
-      </w:r>
-      <w:r>
-        <w:rPr>
-          <w:b/>
-          <w:bCs/>
-          <w:lang w:val="en-IN"/>
-        </w:rPr>
-        <w:t xml:space="preserve"> Samples to First Sale (37.17):</w:t>
-      </w:r>
-      <w:r>
-        <w:rPr>
-          <w:lang w:val="en-IN"/>
-        </w:rPr>
-        <w:t xml:space="preserve"> On average, a new account requires approximately </w:t>
-      </w:r>
-      <w:r>
-        <w:rPr>
-          <w:b/>
-          <w:bCs/>
-          <w:lang w:val="en-IN"/>
-        </w:rPr>
-        <w:t>37 samples</w:t>
-      </w:r>
-      <w:r>
-        <w:rPr>
-          <w:lang w:val="en-IN"/>
-        </w:rPr>
-        <w:t xml:space="preserve"> to move from exploration to their first transaction.</w:t>
-      </w:r>
-    </w:p>
-    <w:p>
-      <w:pPr>
-        <w:pStyle w:val="NormaleWeb"/>
-        <w:spacing w:line="276" w:lineRule="auto"/>
-        <w:rPr>
-          <w:lang w:val="en-IN"/>
-        </w:rPr>
-      </w:pPr>
-      <w:r>
-        <w:rPr>
-          <w:rFonts w:hAnsi="Symbol"/>
-        </w:rPr>
-        <w:t></w:t>
-      </w:r>
-      <w:r>
-        <w:rPr>
-          <w:lang w:val="en-IN"/>
-        </w:rPr>
-        <w:t xml:space="preserve"> </w:t>
-      </w:r>
-      <w:r>
-        <w:rPr>
-          <w:b/>
-          <w:lang w:val="en-IN"/>
-        </w:rPr>
-        <w:t>Business</w:t>
-      </w:r>
-      <w:r>
-        <w:rPr>
-          <w:b/>
-          <w:bCs/>
-          <w:lang w:val="en-IN"/>
-        </w:rPr>
-        <w:t xml:space="preserve"> Impact:</w:t>
-      </w:r>
-      <w:r>
-        <w:rPr>
-          <w:lang w:val="en-IN"/>
-        </w:rPr>
-        <w:t xml:space="preserve"> This is a key indicator of </w:t>
-      </w:r>
-      <w:r>
-        <w:rPr>
-          <w:b/>
-          <w:bCs/>
-          <w:lang w:val="en-IN"/>
-        </w:rPr>
-        <w:t>Customer Acquisition Cost (CAC).</w:t>
-      </w:r>
-      <w:r>
-        <w:rPr>
-          <w:lang w:val="en-IN"/>
-        </w:rPr>
-        <w:t xml:space="preserve"> It represents the "entry price" in physical goods and shipping required to acquire a new active buyer.</w:t>
-      </w:r>
-    </w:p>
-    <w:p>
-      <w:pPr>
-        <w:pStyle w:val="NormaleWeb"/>
-        <w:spacing w:line="276" w:lineRule="auto"/>
-        <w:rPr>
-          <w:lang w:val="en-IN"/>
-        </w:rPr>
-      </w:pPr>
-      <w:r>
-        <w:rPr>
-          <w:rFonts w:hAnsi="Symbol"/>
-        </w:rPr>
-        <w:lastRenderedPageBreak/>
-        <w:t></w:t>
-      </w:r>
-      <w:r>
-        <w:rPr>
-          <w:lang w:val="en-IN"/>
-        </w:rPr>
-        <w:t xml:space="preserve"> </w:t>
-      </w:r>
-      <w:r>
-        <w:rPr>
-          <w:b/>
-          <w:lang w:val="en-IN"/>
-        </w:rPr>
-        <w:t>The</w:t>
-      </w:r>
-      <w:r>
-        <w:rPr>
-          <w:b/>
-          <w:bCs/>
-          <w:lang w:val="en-IN"/>
-        </w:rPr>
-        <w:t xml:space="preserve"> Distribution (Histogram):</w:t>
-      </w:r>
-      <w:r>
-        <w:rPr>
-          <w:lang w:val="en-IN"/>
-        </w:rPr>
-        <w:t xml:space="preserve"> The data is "right-skewed," meaning most designers convert quickly, but a few "heavy samplers" (outliers) request hundreds of items, pulling the average up.</w:t>
-      </w:r>
-    </w:p>
-    <w:p>
-      <w:pPr>
-        <w:pStyle w:val="NormaleWeb"/>
-        <w:spacing w:line="276" w:lineRule="auto"/>
-        <w:rPr>
-          <w:lang w:val="en-IN"/>
-        </w:rPr>
-      </w:pPr>
-      <w:r>
-        <w:rPr>
-          <w:rFonts w:hAnsi="Symbol"/>
-        </w:rPr>
-        <w:t></w:t>
-      </w:r>
-      <w:r>
-        <w:rPr>
-          <w:lang w:val="en-IN"/>
-        </w:rPr>
-        <w:t xml:space="preserve"> </w:t>
-      </w:r>
-      <w:r>
-        <w:rPr>
-          <w:b/>
-          <w:lang w:val="en-IN"/>
-        </w:rPr>
-        <w:t>Operational</w:t>
-      </w:r>
-      <w:r>
-        <w:rPr>
-          <w:b/>
-          <w:bCs/>
-          <w:lang w:val="en-IN"/>
-        </w:rPr>
-        <w:t xml:space="preserve"> Insight:</w:t>
-      </w:r>
-      <w:r>
-        <w:rPr>
-          <w:lang w:val="en-IN"/>
-        </w:rPr>
-        <w:t xml:space="preserve"> Accounts that exceed 40 samples without a sale should be flagged for direct sales intervention to help them close their first project.</w:t>
-      </w:r>
-    </w:p>
-    <w:p>
-      <w:pPr>
-        <w:pStyle w:val="Titolo2"/>
-        <w:rPr>
-          <w:lang w:val="en-IN"/>
-        </w:rPr>
-      </w:pPr>
-      <w:bookmarkStart w:id="20" w:name="_Toc223365925"/>
-      <w:r>
-        <w:rPr>
-          <w:lang w:val="en-IN"/>
-        </w:rPr>
-        <w:t>4.3 Performance Analysis: Conversion Velocity and Efficiency</w:t>
-      </w:r>
-      <w:bookmarkEnd w:id="20"/>
-    </w:p>
-    <w:p>
-      <w:pPr>
-        <w:pStyle w:val="NormaleWeb"/>
-        <w:spacing w:line="276" w:lineRule="auto"/>
-        <w:jc w:val="both"/>
-        <w:rPr>
-          <w:lang w:val="en-IN"/>
-        </w:rPr>
-      </w:pPr>
-      <w:r>
-        <w:rPr>
           <w:noProof/>
-          <w:lang w:val="en-IN"/>
         </w:rPr>
         <w:drawing>
-          <wp:anchor distT="0" distB="0" distL="114300" distR="114300" simplePos="0" relativeHeight="251666432" behindDoc="0" locked="0" layoutInCell="1" allowOverlap="1" wp14:anchorId="273A627F" wp14:editId="60542E28">
+          <wp:anchor distT="0" distB="0" distL="114300" distR="114300" simplePos="0" relativeHeight="251665408" behindDoc="0" locked="0" layoutInCell="1" allowOverlap="1" wp14:anchorId="09BC813D" wp14:editId="3036AC85">
             <wp:simplePos x="0" y="0"/>
-            <wp:positionH relativeFrom="margin">
-              <wp:posOffset>806450</wp:posOffset>
+            <wp:positionH relativeFrom="column">
+              <wp:posOffset>-17047</wp:posOffset>
             </wp:positionH>
             <wp:positionV relativeFrom="paragraph">
-              <wp:posOffset>810260</wp:posOffset>
+              <wp:posOffset>421786</wp:posOffset>
             </wp:positionV>
-            <wp:extent cx="4651375" cy="2694940"/>
-            <wp:effectExtent l="0" t="0" r="0" b="0"/>
+            <wp:extent cx="2661920" cy="2056130"/>
+            <wp:effectExtent l="0" t="0" r="5080" b="1270"/>
             <wp:wrapTopAndBottom/>
-            <wp:docPr id="39" name="Immagine 39"/>
+            <wp:docPr id="38" name="Immagine 38"/>
             <wp:cNvGraphicFramePr>
               <a:graphicFrameLocks xmlns:a="http://schemas.openxmlformats.org/drawingml/2006/main" noChangeAspect="1"/>
             </wp:cNvGraphicFramePr>
@@ -21589,11 +21297,11 @@
               <a:graphicData uri="http://schemas.openxmlformats.org/drawingml/2006/picture">
                 <pic:pic xmlns:pic="http://schemas.openxmlformats.org/drawingml/2006/picture">
                   <pic:nvPicPr>
-                    <pic:cNvPr id="39" name="conversion rate by sample origin.png"/>
+                    <pic:cNvPr id="38" name="sampling intensity.png"/>
                     <pic:cNvPicPr/>
                   </pic:nvPicPr>
                   <pic:blipFill>
-                    <a:blip r:embed="rId15" cstate="print">
+                    <a:blip r:embed="rId15">
                       <a:extLst>
                         <a:ext uri="{28A0092B-C50C-407E-A947-70E740481C1C}">
                           <a14:useLocalDpi xmlns:a14="http://schemas.microsoft.com/office/drawing/2010/main" val="0"/>
@@ -21607,7 +21315,7 @@
                   <pic:spPr>
                     <a:xfrm>
                       <a:off x="0" y="0"/>
-                      <a:ext cx="4651375" cy="2694940"/>
+                      <a:ext cx="2661920" cy="2056130"/>
                     </a:xfrm>
                     <a:prstGeom prst="rect">
                       <a:avLst/>
@@ -21627,6 +21335,316 @@
       </w:r>
       <w:r>
         <w:rPr>
+          <w:lang w:val="en-IN"/>
+        </w:rPr>
+        <w:t>4.2 SAMPLING INTENSITY</w:t>
+      </w:r>
+      <w:bookmarkEnd w:id="19"/>
+    </w:p>
+    <w:p>
+      <w:pPr>
+        <w:pStyle w:val="NormaleWeb"/>
+        <w:spacing w:line="276" w:lineRule="auto"/>
+        <w:rPr>
+          <w:rFonts w:hAnsi="Symbol"/>
+          <w:lang w:val="en-IN"/>
+        </w:rPr>
+      </w:pPr>
+    </w:p>
+    <w:p>
+      <w:pPr>
+        <w:pStyle w:val="NormaleWeb"/>
+        <w:spacing w:line="276" w:lineRule="auto"/>
+        <w:rPr>
+          <w:lang w:val="en-IN"/>
+        </w:rPr>
+      </w:pPr>
+      <w:r>
+        <w:rPr>
+          <w:rFonts w:hAnsi="Symbol"/>
+        </w:rPr>
+        <w:t></w:t>
+      </w:r>
+      <w:r>
+        <w:rPr>
+          <w:lang w:val="en-IN"/>
+        </w:rPr>
+        <w:t xml:space="preserve"> </w:t>
+      </w:r>
+      <w:r>
+        <w:rPr>
+          <w:b/>
+          <w:lang w:val="en-IN"/>
+        </w:rPr>
+        <w:t>Average</w:t>
+      </w:r>
+      <w:r>
+        <w:rPr>
+          <w:b/>
+          <w:bCs/>
+          <w:lang w:val="en-IN"/>
+        </w:rPr>
+        <w:t xml:space="preserve"> Samples to First Sale (37.17):</w:t>
+      </w:r>
+      <w:r>
+        <w:rPr>
+          <w:lang w:val="en-IN"/>
+        </w:rPr>
+        <w:t xml:space="preserve"> On average, a new account requires approximately </w:t>
+      </w:r>
+      <w:r>
+        <w:rPr>
+          <w:b/>
+          <w:bCs/>
+          <w:lang w:val="en-IN"/>
+        </w:rPr>
+        <w:t>37 samples</w:t>
+      </w:r>
+      <w:r>
+        <w:rPr>
+          <w:lang w:val="en-IN"/>
+        </w:rPr>
+        <w:t xml:space="preserve"> to move from exploration to their first transaction.</w:t>
+      </w:r>
+    </w:p>
+    <w:p>
+      <w:pPr>
+        <w:pStyle w:val="NormaleWeb"/>
+        <w:spacing w:line="276" w:lineRule="auto"/>
+        <w:rPr>
+          <w:lang w:val="en-IN"/>
+        </w:rPr>
+      </w:pPr>
+      <w:r>
+        <w:rPr>
+          <w:rFonts w:hAnsi="Symbol"/>
+        </w:rPr>
+        <w:t></w:t>
+      </w:r>
+      <w:r>
+        <w:rPr>
+          <w:lang w:val="en-IN"/>
+        </w:rPr>
+        <w:t xml:space="preserve"> </w:t>
+      </w:r>
+      <w:r>
+        <w:rPr>
+          <w:b/>
+          <w:lang w:val="en-IN"/>
+        </w:rPr>
+        <w:t>Business</w:t>
+      </w:r>
+      <w:r>
+        <w:rPr>
+          <w:b/>
+          <w:bCs/>
+          <w:lang w:val="en-IN"/>
+        </w:rPr>
+        <w:t xml:space="preserve"> Impact:</w:t>
+      </w:r>
+      <w:r>
+        <w:rPr>
+          <w:lang w:val="en-IN"/>
+        </w:rPr>
+        <w:t xml:space="preserve"> This is a key indicator of </w:t>
+      </w:r>
+      <w:r>
+        <w:rPr>
+          <w:b/>
+          <w:bCs/>
+          <w:lang w:val="en-IN"/>
+        </w:rPr>
+        <w:t>Customer Acquisition Cost (CAC).</w:t>
+      </w:r>
+      <w:r>
+        <w:rPr>
+          <w:lang w:val="en-IN"/>
+        </w:rPr>
+        <w:t xml:space="preserve"> It represents the "entry price" in physical goods and shipping required to acquire a new active buyer.</w:t>
+      </w:r>
+    </w:p>
+    <w:p>
+      <w:pPr>
+        <w:pStyle w:val="NormaleWeb"/>
+        <w:spacing w:line="276" w:lineRule="auto"/>
+        <w:rPr>
+          <w:lang w:val="en-IN"/>
+        </w:rPr>
+      </w:pPr>
+      <w:r>
+        <w:rPr>
+          <w:rFonts w:hAnsi="Symbol"/>
+        </w:rPr>
+        <w:t></w:t>
+      </w:r>
+      <w:r>
+        <w:rPr>
+          <w:lang w:val="en-IN"/>
+        </w:rPr>
+        <w:t xml:space="preserve"> </w:t>
+      </w:r>
+      <w:r>
+        <w:rPr>
+          <w:b/>
+          <w:lang w:val="en-IN"/>
+        </w:rPr>
+        <w:t>The</w:t>
+      </w:r>
+      <w:r>
+        <w:rPr>
+          <w:b/>
+          <w:bCs/>
+          <w:lang w:val="en-IN"/>
+        </w:rPr>
+        <w:t xml:space="preserve"> Distribution (Histogram):</w:t>
+      </w:r>
+      <w:r>
+        <w:rPr>
+          <w:lang w:val="en-IN"/>
+        </w:rPr>
+        <w:t xml:space="preserve"> The data is "right-skewed," meaning most designers convert quickly, but a few "heavy samplers" (outliers) request hundreds of items, pulling the average up.</w:t>
+      </w:r>
+    </w:p>
+    <w:p>
+      <w:pPr>
+        <w:pStyle w:val="NormaleWeb"/>
+        <w:spacing w:line="276" w:lineRule="auto"/>
+        <w:rPr>
+          <w:lang w:val="en-IN"/>
+        </w:rPr>
+      </w:pPr>
+      <w:r>
+        <w:rPr>
+          <w:rFonts w:hAnsi="Symbol"/>
+        </w:rPr>
+        <w:t></w:t>
+      </w:r>
+      <w:r>
+        <w:rPr>
+          <w:lang w:val="en-IN"/>
+        </w:rPr>
+        <w:t xml:space="preserve"> </w:t>
+      </w:r>
+      <w:r>
+        <w:rPr>
+          <w:b/>
+          <w:lang w:val="en-IN"/>
+        </w:rPr>
+        <w:t>Operational</w:t>
+      </w:r>
+      <w:r>
+        <w:rPr>
+          <w:b/>
+          <w:bCs/>
+          <w:lang w:val="en-IN"/>
+        </w:rPr>
+        <w:t xml:space="preserve"> Insight:</w:t>
+      </w:r>
+      <w:r>
+        <w:rPr>
+          <w:lang w:val="en-IN"/>
+        </w:rPr>
+        <w:t xml:space="preserve"> Accounts that exceed 40 samples without a sale should be flagged for direct sales intervention to help them close their first project.</w:t>
+      </w:r>
+    </w:p>
+    <w:p>
+      <w:pPr>
+        <w:pStyle w:val="NormaleWeb"/>
+        <w:spacing w:line="276" w:lineRule="auto"/>
+        <w:rPr>
+          <w:lang w:val="en-IN"/>
+        </w:rPr>
+      </w:pPr>
+    </w:p>
+    <w:p>
+      <w:pPr>
+        <w:pStyle w:val="Titolo2"/>
+        <w:rPr>
+          <w:lang w:val="en-IN"/>
+        </w:rPr>
+      </w:pPr>
+      <w:bookmarkStart w:id="20" w:name="_Toc223365925"/>
+      <w:r>
+        <w:rPr>
+          <w:lang w:val="en-IN"/>
+        </w:rPr>
+        <w:lastRenderedPageBreak/>
+        <w:t>4.3 Performance Analysis: Conversion Velocity and Efficiency</w:t>
+      </w:r>
+      <w:bookmarkEnd w:id="20"/>
+    </w:p>
+    <w:p>
+      <w:pPr>
+        <w:pStyle w:val="NormaleWeb"/>
+        <w:spacing w:line="276" w:lineRule="auto"/>
+        <w:jc w:val="both"/>
+        <w:rPr>
+          <w:lang w:val="en-IN"/>
+        </w:rPr>
+      </w:pPr>
+      <w:r>
+        <w:rPr>
+          <w:noProof/>
+          <w:lang w:val="en-IN"/>
+        </w:rPr>
+        <w:drawing>
+          <wp:anchor distT="0" distB="0" distL="114300" distR="114300" simplePos="0" relativeHeight="251666432" behindDoc="0" locked="0" layoutInCell="1" allowOverlap="1" wp14:anchorId="273A627F" wp14:editId="2BA2693A">
+            <wp:simplePos x="0" y="0"/>
+            <wp:positionH relativeFrom="margin">
+              <wp:posOffset>457200</wp:posOffset>
+            </wp:positionH>
+            <wp:positionV relativeFrom="paragraph">
+              <wp:posOffset>808355</wp:posOffset>
+            </wp:positionV>
+            <wp:extent cx="4997450" cy="2895600"/>
+            <wp:effectExtent l="0" t="0" r="0" b="0"/>
+            <wp:wrapTopAndBottom/>
+            <wp:docPr id="39" name="Immagine 39"/>
+            <wp:cNvGraphicFramePr>
+              <a:graphicFrameLocks xmlns:a="http://schemas.openxmlformats.org/drawingml/2006/main" noChangeAspect="1"/>
+            </wp:cNvGraphicFramePr>
+            <a:graphic xmlns:a="http://schemas.openxmlformats.org/drawingml/2006/main">
+              <a:graphicData uri="http://schemas.openxmlformats.org/drawingml/2006/picture">
+                <pic:pic xmlns:pic="http://schemas.openxmlformats.org/drawingml/2006/picture">
+                  <pic:nvPicPr>
+                    <pic:cNvPr id="39" name="conversion rate by sample origin.png"/>
+                    <pic:cNvPicPr/>
+                  </pic:nvPicPr>
+                  <pic:blipFill>
+                    <a:blip r:embed="rId16" cstate="print">
+                      <a:extLst>
+                        <a:ext uri="{28A0092B-C50C-407E-A947-70E740481C1C}">
+                          <a14:useLocalDpi xmlns:a14="http://schemas.microsoft.com/office/drawing/2010/main" val="0"/>
+                        </a:ext>
+                      </a:extLst>
+                    </a:blip>
+                    <a:stretch>
+                      <a:fillRect/>
+                    </a:stretch>
+                  </pic:blipFill>
+                  <pic:spPr>
+                    <a:xfrm>
+                      <a:off x="0" y="0"/>
+                      <a:ext cx="4997450" cy="2895600"/>
+                    </a:xfrm>
+                    <a:prstGeom prst="rect">
+                      <a:avLst/>
+                    </a:prstGeom>
+                  </pic:spPr>
+                </pic:pic>
+              </a:graphicData>
+            </a:graphic>
+            <wp14:sizeRelH relativeFrom="margin">
+              <wp14:pctWidth>0</wp14:pctWidth>
+            </wp14:sizeRelH>
+            <wp14:sizeRelV relativeFrom="margin">
+              <wp14:pctHeight>0</wp14:pctHeight>
+            </wp14:sizeRelV>
+          </wp:anchor>
+        </w:drawing>
+      </w:r>
+      <w:r>
+        <w:rPr>
           <w:rFonts w:hAnsi="Symbol"/>
           <w:b/>
         </w:rPr>
@@ -21698,6 +21716,16 @@
         </w:rPr>
         <w:t>most effectively leads to a finalized sale.</w:t>
       </w:r>
+    </w:p>
+    <w:p>
+      <w:pPr>
+        <w:pStyle w:val="NormaleWeb"/>
+        <w:spacing w:line="276" w:lineRule="auto"/>
+        <w:jc w:val="both"/>
+        <w:rPr>
+          <w:lang w:val="en-IN"/>
+        </w:rPr>
+      </w:pPr>
     </w:p>
     <w:p>
       <w:pPr>
@@ -25088,7 +25116,7 @@
                     <pic:cNvPicPr/>
                   </pic:nvPicPr>
                   <pic:blipFill>
-                    <a:blip r:embed="rId16" cstate="print">
+                    <a:blip r:embed="rId17" cstate="print">
                       <a:extLst>
                         <a:ext uri="{28A0092B-C50C-407E-A947-70E740481C1C}">
                           <a14:useLocalDpi xmlns:a14="http://schemas.microsoft.com/office/drawing/2010/main" val="0"/>
@@ -26091,7 +26119,7 @@
                     <pic:cNvPicPr/>
                   </pic:nvPicPr>
                   <pic:blipFill>
-                    <a:blip r:embed="rId17">
+                    <a:blip r:embed="rId18">
                       <a:extLst>
                         <a:ext uri="{28A0092B-C50C-407E-A947-70E740481C1C}">
                           <a14:useLocalDpi xmlns:a14="http://schemas.microsoft.com/office/drawing/2010/main" val="0"/>
@@ -31573,7 +31601,7 @@
                     <pic:cNvPicPr/>
                   </pic:nvPicPr>
                   <pic:blipFill>
-                    <a:blip r:embed="rId18" cstate="print">
+                    <a:blip r:embed="rId19" cstate="print">
                       <a:extLst>
                         <a:ext uri="{28A0092B-C50C-407E-A947-70E740481C1C}">
                           <a14:useLocalDpi xmlns:a14="http://schemas.microsoft.com/office/drawing/2010/main" val="0"/>
@@ -31797,7 +31825,7 @@
                     <pic:cNvPicPr/>
                   </pic:nvPicPr>
                   <pic:blipFill>
-                    <a:blip r:embed="rId19" cstate="print">
+                    <a:blip r:embed="rId20" cstate="print">
                       <a:extLst>
                         <a:ext uri="{28A0092B-C50C-407E-A947-70E740481C1C}">
                           <a14:useLocalDpi xmlns:a14="http://schemas.microsoft.com/office/drawing/2010/main" val="0"/>
@@ -33534,6 +33562,9 @@
     <w:p>
       <w:pPr>
         <w:pStyle w:val="Titolo2"/>
+        <w:rPr>
+          <w:lang w:val="en-IN"/>
+        </w:rPr>
       </w:pPr>
       <w:bookmarkStart w:id="29" w:name="_Toc223365934"/>
       <w:r>
@@ -33565,7 +33596,7 @@
                     <pic:cNvPicPr/>
                   </pic:nvPicPr>
                   <pic:blipFill>
-                    <a:blip r:embed="rId20">
+                    <a:blip r:embed="rId21">
                       <a:extLst>
                         <a:ext uri="{28A0092B-C50C-407E-A947-70E740481C1C}">
                           <a14:useLocalDpi xmlns:a14="http://schemas.microsoft.com/office/drawing/2010/main" val="0"/>
@@ -35043,43 +35074,21 @@
       </w:pPr>
       <w:r>
         <w:rPr>
-          <w:lang w:val="en-IN"/>
-        </w:rPr>
-        <w:t xml:space="preserve">Since the y-axis is on a </w:t>
-      </w:r>
-      <w:r>
-        <w:rPr>
-          <w:b/>
-          <w:bCs/>
-          <w:lang w:val="en-IN"/>
-        </w:rPr>
-        <w:t>Log Scale</w:t>
-      </w:r>
-      <w:r>
-        <w:rPr>
-          <w:lang w:val="en-IN"/>
-        </w:rPr>
-        <w:t>, it effectively compresses large variances in revenue and sample counts, allowing to compare "average" customers and "high-end" designers on the same chart.</w:t>
-      </w:r>
-    </w:p>
-    <w:p>
-      <w:pPr>
-        <w:pStyle w:val="NormaleWeb"/>
-        <w:spacing w:line="276" w:lineRule="auto"/>
-        <w:jc w:val="both"/>
-        <w:rPr>
-          <w:lang w:val="en-IN"/>
-        </w:rPr>
-      </w:pPr>
-      <w:r>
-        <w:rPr>
           <w:noProof/>
           <w:lang w:val="en-IN"/>
         </w:rPr>
         <w:drawing>
-          <wp:inline distT="0" distB="0" distL="0" distR="0" wp14:anchorId="6039EBC5" wp14:editId="3E14FC21">
-            <wp:extent cx="6589112" cy="3311769"/>
-            <wp:effectExtent l="0" t="0" r="2540" b="3175"/>
+          <wp:anchor distT="0" distB="0" distL="114300" distR="114300" simplePos="0" relativeHeight="251676672" behindDoc="0" locked="0" layoutInCell="1" allowOverlap="1" wp14:anchorId="6039EBC5" wp14:editId="278C4910">
+            <wp:simplePos x="0" y="0"/>
+            <wp:positionH relativeFrom="column">
+              <wp:posOffset>-386080</wp:posOffset>
+            </wp:positionH>
+            <wp:positionV relativeFrom="paragraph">
+              <wp:posOffset>578485</wp:posOffset>
+            </wp:positionV>
+            <wp:extent cx="6588125" cy="3645535"/>
+            <wp:effectExtent l="0" t="0" r="3175" b="0"/>
+            <wp:wrapTopAndBottom/>
             <wp:docPr id="45" name="Immagine 45"/>
             <wp:cNvGraphicFramePr>
               <a:graphicFrameLocks xmlns:a="http://schemas.openxmlformats.org/drawingml/2006/main" noChangeAspect="1"/>
@@ -35092,7 +35101,7 @@
                     <pic:cNvPicPr/>
                   </pic:nvPicPr>
                   <pic:blipFill>
-                    <a:blip r:embed="rId21">
+                    <a:blip r:embed="rId22">
                       <a:extLst>
                         <a:ext uri="{28A0092B-C50C-407E-A947-70E740481C1C}">
                           <a14:useLocalDpi xmlns:a14="http://schemas.microsoft.com/office/drawing/2010/main" val="0"/>
@@ -35106,7 +35115,7 @@
                   <pic:spPr>
                     <a:xfrm>
                       <a:off x="0" y="0"/>
-                      <a:ext cx="6633959" cy="3334310"/>
+                      <a:ext cx="6588125" cy="3645535"/>
                     </a:xfrm>
                     <a:prstGeom prst="rect">
                       <a:avLst/>
@@ -35115,8 +35124,31 @@
                 </pic:pic>
               </a:graphicData>
             </a:graphic>
-          </wp:inline>
+            <wp14:sizeRelV relativeFrom="margin">
+              <wp14:pctHeight>0</wp14:pctHeight>
+            </wp14:sizeRelV>
+          </wp:anchor>
         </w:drawing>
+      </w:r>
+      <w:r>
+        <w:rPr>
+          <w:lang w:val="en-IN"/>
+        </w:rPr>
+        <w:t xml:space="preserve">Since the y-axis is on a </w:t>
+      </w:r>
+      <w:r>
+        <w:rPr>
+          <w:b/>
+          <w:bCs/>
+          <w:lang w:val="en-IN"/>
+        </w:rPr>
+        <w:t>Log Scale</w:t>
+      </w:r>
+      <w:r>
+        <w:rPr>
+          <w:lang w:val="en-IN"/>
+        </w:rPr>
+        <w:t>, it effectively compresses large variances in revenue and sample counts, allowing to compare "average" customers and "high-end" designers on the same chart.</w:t>
       </w:r>
     </w:p>
     <w:p>
@@ -35599,16 +35631,16 @@
           <w:lang w:val="en-IN"/>
         </w:rPr>
         <w:drawing>
-          <wp:anchor distT="0" distB="0" distL="114300" distR="114300" simplePos="0" relativeHeight="251674624" behindDoc="0" locked="0" layoutInCell="1" allowOverlap="1" wp14:anchorId="37189C3B" wp14:editId="0BE1FD73">
+          <wp:anchor distT="0" distB="0" distL="114300" distR="114300" simplePos="0" relativeHeight="251674624" behindDoc="0" locked="0" layoutInCell="1" allowOverlap="1" wp14:anchorId="37189C3B" wp14:editId="7D861CA8">
             <wp:simplePos x="0" y="0"/>
             <wp:positionH relativeFrom="column">
-              <wp:posOffset>1756410</wp:posOffset>
+              <wp:posOffset>1825332</wp:posOffset>
             </wp:positionH>
             <wp:positionV relativeFrom="paragraph">
-              <wp:posOffset>598805</wp:posOffset>
+              <wp:posOffset>668508</wp:posOffset>
             </wp:positionV>
-            <wp:extent cx="2686050" cy="2559801"/>
-            <wp:effectExtent l="0" t="0" r="0" b="0"/>
+            <wp:extent cx="2607945" cy="2484755"/>
+            <wp:effectExtent l="0" t="0" r="1905" b="0"/>
             <wp:wrapTopAndBottom/>
             <wp:docPr id="46" name="Immagine 46"/>
             <wp:cNvGraphicFramePr>
@@ -35622,7 +35654,7 @@
                     <pic:cNvPicPr/>
                   </pic:nvPicPr>
                   <pic:blipFill>
-                    <a:blip r:embed="rId22" cstate="print">
+                    <a:blip r:embed="rId23" cstate="print">
                       <a:extLst>
                         <a:ext uri="{28A0092B-C50C-407E-A947-70E740481C1C}">
                           <a14:useLocalDpi xmlns:a14="http://schemas.microsoft.com/office/drawing/2010/main" val="0"/>
@@ -35636,7 +35668,7 @@
                   <pic:spPr>
                     <a:xfrm>
                       <a:off x="0" y="0"/>
-                      <a:ext cx="2686050" cy="2559801"/>
+                      <a:ext cx="2607945" cy="2484755"/>
                     </a:xfrm>
                     <a:prstGeom prst="rect">
                       <a:avLst/>
@@ -35868,7 +35900,6 @@
       </w:pPr>
       <w:r>
         <w:rPr>
-          <w:i/>
           <w:iCs/>
           <w:lang w:val="en-IN"/>
         </w:rPr>
@@ -35973,7 +36004,6 @@
       </w:pPr>
       <w:r>
         <w:rPr>
-          <w:i/>
           <w:iCs/>
           <w:lang w:val="en-IN"/>
         </w:rPr>
@@ -36016,7 +36046,7 @@
                     <pic:cNvPicPr/>
                   </pic:nvPicPr>
                   <pic:blipFill>
-                    <a:blip r:embed="rId23">
+                    <a:blip r:embed="rId24">
                       <a:extLst>
                         <a:ext uri="{28A0092B-C50C-407E-A947-70E740481C1C}">
                           <a14:useLocalDpi xmlns:a14="http://schemas.microsoft.com/office/drawing/2010/main" val="0"/>
@@ -37181,7 +37211,7 @@
                     <pic:cNvPicPr/>
                   </pic:nvPicPr>
                   <pic:blipFill>
-                    <a:blip r:embed="rId24">
+                    <a:blip r:embed="rId25">
                       <a:extLst>
                         <a:ext uri="{28A0092B-C50C-407E-A947-70E740481C1C}">
                           <a14:useLocalDpi xmlns:a14="http://schemas.microsoft.com/office/drawing/2010/main" val="0"/>
@@ -38303,7 +38333,7 @@
                     <pic:cNvPicPr/>
                   </pic:nvPicPr>
                   <pic:blipFill>
-                    <a:blip r:embed="rId25" cstate="print">
+                    <a:blip r:embed="rId26" cstate="print">
                       <a:extLst>
                         <a:ext uri="{28A0092B-C50C-407E-A947-70E740481C1C}">
                           <a14:useLocalDpi xmlns:a14="http://schemas.microsoft.com/office/drawing/2010/main" val="0"/>
@@ -38662,83 +38692,273 @@
     </w:p>
     <w:p>
       <w:pPr>
+        <w:spacing w:beforeAutospacing="1" w:after="100" w:afterAutospacing="1"/>
         <w:jc w:val="both"/>
         <w:rPr>
-          <w:rFonts w:ascii="Times New Roman" w:hAnsi="Times New Roman" w:cs="Times New Roman"/>
+          <w:rFonts w:ascii="Times New Roman" w:eastAsia="Times New Roman" w:hAnsi="Times New Roman" w:cs="Times New Roman"/>
           <w:sz w:val="24"/>
-          <w:lang w:val="en-IN"/>
-        </w:rPr>
-      </w:pPr>
-      <w:r>
-        <w:rPr>
-          <w:rFonts w:ascii="Times New Roman" w:hAnsi="Times New Roman" w:cs="Times New Roman"/>
+          <w:szCs w:val="24"/>
+          <w:lang w:val="en-IN" w:eastAsia="it-IT"/>
+        </w:rPr>
+      </w:pPr>
+      <w:r>
+        <w:rPr>
+          <w:rFonts w:ascii="Times New Roman" w:eastAsia="Times New Roman" w:hAnsi="Symbol" w:cs="Times New Roman"/>
           <w:sz w:val="24"/>
-          <w:lang w:val="en-IN"/>
-        </w:rPr>
-        <w:t xml:space="preserve">The </w:t>
-      </w:r>
-      <w:r>
-        <w:rPr>
-          <w:rFonts w:ascii="Times New Roman" w:hAnsi="Times New Roman" w:cs="Times New Roman"/>
+          <w:szCs w:val="24"/>
+          <w:lang w:eastAsia="it-IT"/>
+        </w:rPr>
+        <w:t></w:t>
+      </w:r>
+      <w:r>
+        <w:rPr>
+          <w:rFonts w:ascii="Times New Roman" w:eastAsia="Times New Roman" w:hAnsi="Times New Roman" w:cs="Times New Roman"/>
+          <w:sz w:val="24"/>
+          <w:szCs w:val="24"/>
+          <w:lang w:val="en-IN" w:eastAsia="it-IT"/>
+        </w:rPr>
+        <w:t xml:space="preserve"> </w:t>
+      </w:r>
+      <w:r>
+        <w:rPr>
+          <w:rFonts w:ascii="Times New Roman" w:eastAsia="Times New Roman" w:hAnsi="Times New Roman" w:cs="Times New Roman"/>
+          <w:b/>
+          <w:sz w:val="24"/>
+          <w:szCs w:val="24"/>
+          <w:lang w:val="en-IN" w:eastAsia="it-IT"/>
+        </w:rPr>
+        <w:t>The</w:t>
+      </w:r>
+      <w:r>
+        <w:rPr>
+          <w:rFonts w:ascii="Times New Roman" w:eastAsia="Times New Roman" w:hAnsi="Times New Roman" w:cs="Times New Roman"/>
           <w:b/>
           <w:bCs/>
           <w:sz w:val="24"/>
-          <w:lang w:val="en-IN"/>
-        </w:rPr>
-        <w:t>Price Elasticity of Demand</w:t>
-      </w:r>
-      <w:r>
-        <w:rPr>
-          <w:rFonts w:ascii="Times New Roman" w:hAnsi="Times New Roman" w:cs="Times New Roman"/>
+          <w:szCs w:val="24"/>
+          <w:lang w:val="en-IN" w:eastAsia="it-IT"/>
+        </w:rPr>
+        <w:t xml:space="preserve"> "Goldilocks" Zone ($100–250):</w:t>
+      </w:r>
+      <w:r>
+        <w:rPr>
+          <w:rFonts w:ascii="Times New Roman" w:eastAsia="Times New Roman" w:hAnsi="Times New Roman" w:cs="Times New Roman"/>
           <w:sz w:val="24"/>
-          <w:lang w:val="en-IN"/>
-        </w:rPr>
-        <w:t xml:space="preserve"> analysis reveals a distinct inverse relationship between unit price and quantity sold, characterized by a high sensitivity in the lower price brackets. As prices exceed the </w:t>
-      </w:r>
-      <w:r>
-        <w:rPr>
-          <w:rFonts w:ascii="Times New Roman" w:hAnsi="Times New Roman" w:cs="Times New Roman"/>
+          <w:szCs w:val="24"/>
+          <w:lang w:val="en-IN" w:eastAsia="it-IT"/>
+        </w:rPr>
+        <w:t xml:space="preserve"> This bracket is the high-performer, achieving a peak conversion rate of </w:t>
+      </w:r>
+      <w:r>
+        <w:rPr>
+          <w:rFonts w:ascii="Times New Roman" w:eastAsia="Times New Roman" w:hAnsi="Times New Roman" w:cs="Times New Roman"/>
           <w:b/>
           <w:bCs/>
           <w:sz w:val="24"/>
-          <w:lang w:val="en-IN"/>
-        </w:rPr>
-        <w:t>$200–$300 threshold</w:t>
-      </w:r>
-      <w:r>
-        <w:rPr>
-          <w:rFonts w:ascii="Times New Roman" w:hAnsi="Times New Roman" w:cs="Times New Roman"/>
+          <w:szCs w:val="24"/>
+          <w:lang w:val="en-IN" w:eastAsia="it-IT"/>
+        </w:rPr>
+        <w:t>55.3%</w:t>
+      </w:r>
+      <w:r>
+        <w:rPr>
+          <w:rFonts w:ascii="Times New Roman" w:eastAsia="Times New Roman" w:hAnsi="Times New Roman" w:cs="Times New Roman"/>
           <w:sz w:val="24"/>
-          <w:lang w:val="en-IN"/>
-        </w:rPr>
-        <w:t xml:space="preserve">, we observe a 'long tail' distribution where demand stabilizes despite price increases—a hallmark of luxury positioning. This suggests that for premium 'Luxe' segments, purchasing decisions are driven more by </w:t>
-      </w:r>
-      <w:r>
-        <w:rPr>
-          <w:rFonts w:ascii="Times New Roman" w:hAnsi="Times New Roman" w:cs="Times New Roman"/>
+          <w:szCs w:val="24"/>
+          <w:lang w:val="en-IN" w:eastAsia="it-IT"/>
+        </w:rPr>
+        <w:t>. It suggests this price point offers the best balance of perceived value and consumer trust.</w:t>
+      </w:r>
+    </w:p>
+    <w:p>
+      <w:pPr>
+        <w:spacing w:beforeAutospacing="1" w:after="100" w:afterAutospacing="1"/>
+        <w:jc w:val="both"/>
+        <w:rPr>
+          <w:rFonts w:ascii="Times New Roman" w:eastAsia="Times New Roman" w:hAnsi="Times New Roman" w:cs="Times New Roman"/>
+          <w:sz w:val="24"/>
+          <w:szCs w:val="24"/>
+          <w:lang w:val="en-IN" w:eastAsia="it-IT"/>
+        </w:rPr>
+      </w:pPr>
+      <w:r>
+        <w:rPr>
+          <w:rFonts w:ascii="Times New Roman" w:eastAsia="Times New Roman" w:hAnsi="Symbol" w:cs="Times New Roman"/>
+          <w:sz w:val="24"/>
+          <w:szCs w:val="24"/>
+          <w:lang w:eastAsia="it-IT"/>
+        </w:rPr>
+        <w:t></w:t>
+      </w:r>
+      <w:r>
+        <w:rPr>
+          <w:rFonts w:ascii="Times New Roman" w:eastAsia="Times New Roman" w:hAnsi="Times New Roman" w:cs="Times New Roman"/>
+          <w:sz w:val="24"/>
+          <w:szCs w:val="24"/>
+          <w:lang w:val="en-IN" w:eastAsia="it-IT"/>
+        </w:rPr>
+        <w:t xml:space="preserve"> </w:t>
+      </w:r>
+      <w:r>
+        <w:rPr>
+          <w:rFonts w:ascii="Times New Roman" w:eastAsia="Times New Roman" w:hAnsi="Times New Roman" w:cs="Times New Roman"/>
+          <w:b/>
+          <w:sz w:val="24"/>
+          <w:szCs w:val="24"/>
+          <w:lang w:val="en-IN" w:eastAsia="it-IT"/>
+        </w:rPr>
+        <w:t>Positive</w:t>
+      </w:r>
+      <w:r>
+        <w:rPr>
+          <w:rFonts w:ascii="Times New Roman" w:eastAsia="Times New Roman" w:hAnsi="Times New Roman" w:cs="Times New Roman"/>
           <w:b/>
           <w:bCs/>
           <w:sz w:val="24"/>
-          <w:lang w:val="en-IN"/>
-        </w:rPr>
-        <w:t>design exclusivity and motif affinity</w:t>
-      </w:r>
-      <w:r>
-        <w:rPr>
-          <w:rFonts w:ascii="Times New Roman" w:hAnsi="Times New Roman" w:cs="Times New Roman"/>
+          <w:szCs w:val="24"/>
+          <w:lang w:val="en-IN" w:eastAsia="it-IT"/>
+        </w:rPr>
+        <w:t xml:space="preserve"> Momentum ($0–100):</w:t>
+      </w:r>
+      <w:r>
+        <w:rPr>
+          <w:rFonts w:ascii="Times New Roman" w:eastAsia="Times New Roman" w:hAnsi="Times New Roman" w:cs="Times New Roman"/>
           <w:sz w:val="24"/>
-          <w:lang w:val="en-IN"/>
-        </w:rPr>
-        <w:t xml:space="preserve"> than by marginal price changes, presenting a significant opportunity for value-based pricing rather than volume-based discounting.</w:t>
+          <w:szCs w:val="24"/>
+          <w:lang w:val="en-IN" w:eastAsia="it-IT"/>
+        </w:rPr>
+        <w:t xml:space="preserve"> Conversion rates scale significantly as price increases from the entry-level bracket (</w:t>
+      </w:r>
+      <w:r>
+        <w:rPr>
+          <w:rFonts w:ascii="Times New Roman" w:eastAsia="Times New Roman" w:hAnsi="Times New Roman" w:cs="Times New Roman"/>
+          <w:b/>
+          <w:bCs/>
+          <w:sz w:val="24"/>
+          <w:szCs w:val="24"/>
+          <w:lang w:val="en-IN" w:eastAsia="it-IT"/>
+        </w:rPr>
+        <w:t>25.8%</w:t>
+      </w:r>
+      <w:r>
+        <w:rPr>
+          <w:rFonts w:ascii="Times New Roman" w:eastAsia="Times New Roman" w:hAnsi="Times New Roman" w:cs="Times New Roman"/>
+          <w:sz w:val="24"/>
+          <w:szCs w:val="24"/>
+          <w:lang w:val="en-IN" w:eastAsia="it-IT"/>
+        </w:rPr>
+        <w:t>) to the sub-$100 bracket (</w:t>
+      </w:r>
+      <w:r>
+        <w:rPr>
+          <w:rFonts w:ascii="Times New Roman" w:eastAsia="Times New Roman" w:hAnsi="Times New Roman" w:cs="Times New Roman"/>
+          <w:b/>
+          <w:bCs/>
+          <w:sz w:val="24"/>
+          <w:szCs w:val="24"/>
+          <w:lang w:val="en-IN" w:eastAsia="it-IT"/>
+        </w:rPr>
+        <w:t>46.3%</w:t>
+      </w:r>
+      <w:r>
+        <w:rPr>
+          <w:rFonts w:ascii="Times New Roman" w:eastAsia="Times New Roman" w:hAnsi="Times New Roman" w:cs="Times New Roman"/>
+          <w:sz w:val="24"/>
+          <w:szCs w:val="24"/>
+          <w:lang w:val="en-IN" w:eastAsia="it-IT"/>
+        </w:rPr>
+        <w:t>), indicating that "cheaper" does not necessarily mean "more likely to buy" in this market.</w:t>
       </w:r>
     </w:p>
     <w:p>
       <w:pPr>
+        <w:spacing w:beforeAutospacing="1" w:after="100" w:afterAutospacing="1"/>
         <w:jc w:val="both"/>
         <w:rPr>
-          <w:rFonts w:ascii="Times New Roman" w:hAnsi="Times New Roman" w:cs="Times New Roman"/>
+          <w:rFonts w:ascii="Times New Roman" w:eastAsia="Times New Roman" w:hAnsi="Times New Roman" w:cs="Times New Roman"/>
           <w:sz w:val="24"/>
-          <w:lang w:val="en-IN"/>
+          <w:szCs w:val="24"/>
+          <w:lang w:val="en-IN" w:eastAsia="it-IT"/>
+        </w:rPr>
+      </w:pPr>
+      <w:r>
+        <w:rPr>
+          <w:rFonts w:ascii="Times New Roman" w:eastAsia="Times New Roman" w:hAnsi="Symbol" w:cs="Times New Roman"/>
+          <w:sz w:val="24"/>
+          <w:szCs w:val="24"/>
+          <w:lang w:eastAsia="it-IT"/>
+        </w:rPr>
+        <w:t></w:t>
+      </w:r>
+      <w:r>
+        <w:rPr>
+          <w:rFonts w:ascii="Times New Roman" w:eastAsia="Times New Roman" w:hAnsi="Times New Roman" w:cs="Times New Roman"/>
+          <w:sz w:val="24"/>
+          <w:szCs w:val="24"/>
+          <w:lang w:val="en-IN" w:eastAsia="it-IT"/>
+        </w:rPr>
+        <w:t xml:space="preserve"> </w:t>
+      </w:r>
+      <w:r>
+        <w:rPr>
+          <w:rFonts w:ascii="Times New Roman" w:eastAsia="Times New Roman" w:hAnsi="Times New Roman" w:cs="Times New Roman"/>
+          <w:b/>
+          <w:sz w:val="24"/>
+          <w:szCs w:val="24"/>
+          <w:lang w:val="en-IN" w:eastAsia="it-IT"/>
+        </w:rPr>
+        <w:t>The</w:t>
+      </w:r>
+      <w:r>
+        <w:rPr>
+          <w:rFonts w:ascii="Times New Roman" w:eastAsia="Times New Roman" w:hAnsi="Times New Roman" w:cs="Times New Roman"/>
+          <w:b/>
+          <w:bCs/>
+          <w:sz w:val="24"/>
+          <w:szCs w:val="24"/>
+          <w:lang w:val="en-IN" w:eastAsia="it-IT"/>
+        </w:rPr>
+        <w:t xml:space="preserve"> Resistance Threshold ($250+):</w:t>
+      </w:r>
+      <w:r>
+        <w:rPr>
+          <w:rFonts w:ascii="Times New Roman" w:eastAsia="Times New Roman" w:hAnsi="Times New Roman" w:cs="Times New Roman"/>
+          <w:sz w:val="24"/>
+          <w:szCs w:val="24"/>
+          <w:lang w:val="en-IN" w:eastAsia="it-IT"/>
+        </w:rPr>
+        <w:t xml:space="preserve"> We see a sharp "conversion cliff" once the price exceeds $250. Conversion drops by </w:t>
+      </w:r>
+      <w:r>
+        <w:rPr>
+          <w:rFonts w:ascii="Times New Roman" w:eastAsia="Times New Roman" w:hAnsi="Times New Roman" w:cs="Times New Roman"/>
+          <w:b/>
+          <w:bCs/>
+          <w:sz w:val="24"/>
+          <w:szCs w:val="24"/>
+          <w:lang w:val="en-IN" w:eastAsia="it-IT"/>
+        </w:rPr>
+        <w:t>over 60%</w:t>
+      </w:r>
+      <w:r>
+        <w:rPr>
+          <w:rFonts w:ascii="Times New Roman" w:eastAsia="Times New Roman" w:hAnsi="Times New Roman" w:cs="Times New Roman"/>
+          <w:sz w:val="24"/>
+          <w:szCs w:val="24"/>
+          <w:lang w:val="en-IN" w:eastAsia="it-IT"/>
+        </w:rPr>
+        <w:t xml:space="preserve"> (from 55.3% to 19.3%) when moving into the $250–500 range.</w:t>
+      </w:r>
+    </w:p>
+    <w:p>
+      <w:pPr>
+        <w:spacing w:beforeAutospacing="1" w:after="100" w:afterAutospacing="1"/>
+        <w:jc w:val="both"/>
+        <w:rPr>
+          <w:rFonts w:ascii="Times New Roman" w:eastAsia="Times New Roman" w:hAnsi="Times New Roman" w:cs="Times New Roman"/>
+          <w:sz w:val="24"/>
+          <w:szCs w:val="24"/>
+          <w:lang w:val="en-IN" w:eastAsia="it-IT"/>
         </w:rPr>
       </w:pPr>
       <w:r>
@@ -38749,9 +38969,17 @@
           <w:lang w:val="en-IN"/>
         </w:rPr>
         <w:drawing>
-          <wp:inline distT="0" distB="0" distL="0" distR="0" wp14:anchorId="75CA06E8" wp14:editId="3A03925F">
-            <wp:extent cx="6120130" cy="3373120"/>
+          <wp:anchor distT="0" distB="0" distL="114300" distR="114300" simplePos="0" relativeHeight="251677696" behindDoc="0" locked="0" layoutInCell="1" allowOverlap="1" wp14:anchorId="75CA06E8" wp14:editId="14130E16">
+            <wp:simplePos x="0" y="0"/>
+            <wp:positionH relativeFrom="column">
+              <wp:posOffset>885825</wp:posOffset>
+            </wp:positionH>
+            <wp:positionV relativeFrom="paragraph">
+              <wp:posOffset>709930</wp:posOffset>
+            </wp:positionV>
+            <wp:extent cx="4771390" cy="2629535"/>
             <wp:effectExtent l="0" t="0" r="0" b="0"/>
+            <wp:wrapTopAndBottom/>
             <wp:docPr id="52" name="Immagine 52"/>
             <wp:cNvGraphicFramePr>
               <a:graphicFrameLocks xmlns:a="http://schemas.openxmlformats.org/drawingml/2006/main" noChangeAspect="1"/>
@@ -38764,7 +38992,7 @@
                     <pic:cNvPicPr/>
                   </pic:nvPicPr>
                   <pic:blipFill>
-                    <a:blip r:embed="rId26">
+                    <a:blip r:embed="rId27">
                       <a:extLst>
                         <a:ext uri="{28A0092B-C50C-407E-A947-70E740481C1C}">
                           <a14:useLocalDpi xmlns:a14="http://schemas.microsoft.com/office/drawing/2010/main" val="0"/>
@@ -38778,7 +39006,7 @@
                   <pic:spPr>
                     <a:xfrm>
                       <a:off x="0" y="0"/>
-                      <a:ext cx="6120130" cy="3373120"/>
+                      <a:ext cx="4771390" cy="2629535"/>
                     </a:xfrm>
                     <a:prstGeom prst="rect">
                       <a:avLst/>
@@ -38787,38 +39015,94 @@
                 </pic:pic>
               </a:graphicData>
             </a:graphic>
-          </wp:inline>
+            <wp14:sizeRelH relativeFrom="margin">
+              <wp14:pctWidth>0</wp14:pctWidth>
+            </wp14:sizeRelH>
+            <wp14:sizeRelV relativeFrom="margin">
+              <wp14:pctHeight>0</wp14:pctHeight>
+            </wp14:sizeRelV>
+          </wp:anchor>
         </w:drawing>
+      </w:r>
+      <w:r>
+        <w:rPr>
+          <w:rFonts w:ascii="Times New Roman" w:eastAsia="Times New Roman" w:hAnsi="Symbol" w:cs="Times New Roman"/>
+          <w:sz w:val="24"/>
+          <w:szCs w:val="24"/>
+          <w:lang w:eastAsia="it-IT"/>
+        </w:rPr>
+        <w:t></w:t>
+      </w:r>
+      <w:r>
+        <w:rPr>
+          <w:rFonts w:ascii="Times New Roman" w:eastAsia="Times New Roman" w:hAnsi="Times New Roman" w:cs="Times New Roman"/>
+          <w:sz w:val="24"/>
+          <w:szCs w:val="24"/>
+          <w:lang w:val="en-IN" w:eastAsia="it-IT"/>
+        </w:rPr>
+        <w:t xml:space="preserve"> </w:t>
+      </w:r>
+      <w:r>
+        <w:rPr>
+          <w:rFonts w:ascii="Times New Roman" w:eastAsia="Times New Roman" w:hAnsi="Times New Roman" w:cs="Times New Roman"/>
+          <w:b/>
+          <w:sz w:val="24"/>
+          <w:szCs w:val="24"/>
+          <w:lang w:val="en-IN" w:eastAsia="it-IT"/>
+        </w:rPr>
+        <w:t>High</w:t>
+      </w:r>
+      <w:r>
+        <w:rPr>
+          <w:rFonts w:ascii="Times New Roman" w:eastAsia="Times New Roman" w:hAnsi="Times New Roman" w:cs="Times New Roman"/>
+          <w:b/>
+          <w:bCs/>
+          <w:sz w:val="24"/>
+          <w:szCs w:val="24"/>
+          <w:lang w:val="en-IN" w:eastAsia="it-IT"/>
+        </w:rPr>
+        <w:t>-Ticket Friction ($1k+):</w:t>
+      </w:r>
+      <w:r>
+        <w:rPr>
+          <w:rFonts w:ascii="Times New Roman" w:eastAsia="Times New Roman" w:hAnsi="Times New Roman" w:cs="Times New Roman"/>
+          <w:sz w:val="24"/>
+          <w:szCs w:val="24"/>
+          <w:lang w:val="en-IN" w:eastAsia="it-IT"/>
+        </w:rPr>
+        <w:t xml:space="preserve"> The conversion rate bottoms out at </w:t>
+      </w:r>
+      <w:r>
+        <w:rPr>
+          <w:rFonts w:ascii="Times New Roman" w:eastAsia="Times New Roman" w:hAnsi="Times New Roman" w:cs="Times New Roman"/>
+          <w:b/>
+          <w:bCs/>
+          <w:sz w:val="24"/>
+          <w:szCs w:val="24"/>
+          <w:lang w:val="en-IN" w:eastAsia="it-IT"/>
+        </w:rPr>
+        <w:t>5.4%</w:t>
+      </w:r>
+      <w:r>
+        <w:rPr>
+          <w:rFonts w:ascii="Times New Roman" w:eastAsia="Times New Roman" w:hAnsi="Times New Roman" w:cs="Times New Roman"/>
+          <w:sz w:val="24"/>
+          <w:szCs w:val="24"/>
+          <w:lang w:val="en-IN" w:eastAsia="it-IT"/>
+        </w:rPr>
+        <w:t xml:space="preserve"> for items over $1,000. These products likely require a much longer sales cycle or a different marketing funnel (e.g., direct sales calls vs. self-checkout).</w:t>
       </w:r>
     </w:p>
     <w:p>
       <w:pPr>
-        <w:jc w:val="both"/>
-        <w:rPr>
-          <w:rFonts w:ascii="Times New Roman" w:hAnsi="Times New Roman" w:cs="Times New Roman"/>
-          <w:sz w:val="24"/>
-          <w:lang w:val="en-IN"/>
-        </w:rPr>
-      </w:pPr>
-    </w:p>
-    <w:p>
-      <w:pPr>
-        <w:jc w:val="both"/>
-        <w:rPr>
-          <w:rFonts w:ascii="Times New Roman" w:hAnsi="Times New Roman" w:cs="Times New Roman"/>
-          <w:sz w:val="24"/>
-          <w:lang w:val="en-IN"/>
-        </w:rPr>
-      </w:pPr>
-    </w:p>
-    <w:p>
-      <w:pPr>
         <w:pStyle w:val="Titolo2"/>
         <w:rPr>
           <w:lang w:val="en-IN"/>
         </w:rPr>
       </w:pPr>
       <w:bookmarkStart w:id="37" w:name="_Toc223365942"/>
+      <w:bookmarkStart w:id="38" w:name="_GoBack"/>
+      <w:bookmarkEnd w:id="38"/>
       <w:r>
         <w:rPr>
           <w:lang w:val="en-IN"/>
@@ -38994,7 +39278,7 @@
                     <pic:cNvPicPr/>
                   </pic:nvPicPr>
                   <pic:blipFill>
-                    <a:blip r:embed="rId27">
+                    <a:blip r:embed="rId28">
                       <a:extLst>
                         <a:ext uri="{28A0092B-C50C-407E-A947-70E740481C1C}">
                           <a14:useLocalDpi xmlns:a14="http://schemas.microsoft.com/office/drawing/2010/main" val="0"/>
@@ -39063,7 +39347,7 @@
           <w:lang w:val="en-IN"/>
         </w:rPr>
       </w:pPr>
-      <w:bookmarkStart w:id="38" w:name="_Toc223365943"/>
+      <w:bookmarkStart w:id="39" w:name="_Toc223365943"/>
       <w:r>
         <w:rPr>
           <w:b/>
@@ -39072,7 +39356,7 @@
         <w:lastRenderedPageBreak/>
         <w:t>7.0 Architectural Design of the Personalized Recommendation Engine</w:t>
       </w:r>
-      <w:bookmarkEnd w:id="38"/>
+      <w:bookmarkEnd w:id="39"/>
     </w:p>
     <w:p>
       <w:pPr>
@@ -45568,7 +45852,7 @@
                     <pic:cNvPicPr/>
                   </pic:nvPicPr>
                   <pic:blipFill>
-                    <a:blip r:embed="rId28" cstate="print">
+                    <a:blip r:embed="rId29" cstate="print">
                       <a:extLst>
                         <a:ext uri="{28A0092B-C50C-407E-A947-70E740481C1C}">
                           <a14:useLocalDpi xmlns:a14="http://schemas.microsoft.com/office/drawing/2010/main" val="0"/>
@@ -45603,7 +45887,7 @@
           <w:lang w:val="en-IN"/>
         </w:rPr>
       </w:pPr>
-      <w:bookmarkStart w:id="39" w:name="_Toc223365944"/>
+      <w:bookmarkStart w:id="40" w:name="_Toc223365944"/>
       <w:r>
         <w:rPr>
           <w:b/>
@@ -45626,7 +45910,7 @@
         </w:rPr>
         <w:t>RECOMMENDATIONS</w:t>
       </w:r>
-      <w:bookmarkEnd w:id="39"/>
+      <w:bookmarkEnd w:id="40"/>
     </w:p>
     <w:p>
       <w:pPr>
@@ -45635,14 +45919,14 @@
           <w:lang w:val="en-IN"/>
         </w:rPr>
       </w:pPr>
-      <w:bookmarkStart w:id="40" w:name="_Toc223365945"/>
+      <w:bookmarkStart w:id="41" w:name="_Toc223365945"/>
       <w:r>
         <w:rPr>
           <w:lang w:val="en-IN"/>
         </w:rPr>
         <w:t>8.1 Executive Summary</w:t>
       </w:r>
-      <w:bookmarkEnd w:id="40"/>
+      <w:bookmarkEnd w:id="41"/>
     </w:p>
     <w:p>
       <w:pPr>
@@ -45684,14 +45968,14 @@
           <w:lang w:val="en-IN"/>
         </w:rPr>
       </w:pPr>
-      <w:bookmarkStart w:id="41" w:name="_Toc223365946"/>
+      <w:bookmarkStart w:id="42" w:name="_Toc223365946"/>
       <w:r>
         <w:rPr>
           <w:lang w:val="en-IN"/>
         </w:rPr>
         <w:t>Optimization Recommendation: Predictive Conversion Funnel</w:t>
       </w:r>
-      <w:bookmarkEnd w:id="41"/>
+      <w:bookmarkEnd w:id="42"/>
     </w:p>
     <w:p>
       <w:pPr>
@@ -45839,14 +46123,14 @@
           <w:lang w:val="en-IN"/>
         </w:rPr>
       </w:pPr>
-      <w:bookmarkStart w:id="42" w:name="_Toc223365947"/>
+      <w:bookmarkStart w:id="43" w:name="_Toc223365947"/>
       <w:r>
         <w:rPr>
           <w:lang w:val="en-IN"/>
         </w:rPr>
         <w:t>8.3 Optimization Recommendation: Dynamic Customer Lifecycle Management</w:t>
       </w:r>
-      <w:bookmarkEnd w:id="42"/>
+      <w:bookmarkEnd w:id="43"/>
     </w:p>
     <w:p>
       <w:pPr>
@@ -46083,14 +46367,14 @@
           <w:lang w:val="en-IN"/>
         </w:rPr>
       </w:pPr>
-      <w:bookmarkStart w:id="43" w:name="_Toc223365948"/>
+      <w:bookmarkStart w:id="44" w:name="_Toc223365948"/>
       <w:r>
         <w:rPr>
           <w:lang w:val="en-IN"/>
         </w:rPr>
         <w:t>8.4 Optimization Recommendation: Affinity-Based Merchandising</w:t>
       </w:r>
-      <w:bookmarkEnd w:id="43"/>
+      <w:bookmarkEnd w:id="44"/>
     </w:p>
     <w:p>
       <w:pPr>
@@ -46318,14 +46602,14 @@
           <w:lang w:val="en-IN"/>
         </w:rPr>
       </w:pPr>
-      <w:bookmarkStart w:id="44" w:name="_Toc223365949"/>
+      <w:bookmarkStart w:id="45" w:name="_Toc223365949"/>
       <w:r>
         <w:rPr>
           <w:lang w:val="en-IN"/>
         </w:rPr>
         <w:t>8.5 Optimization Recommendation: Regional Resource Allocation</w:t>
       </w:r>
-      <w:bookmarkEnd w:id="44"/>
+      <w:bookmarkEnd w:id="45"/>
     </w:p>
     <w:p>
       <w:pPr>
@@ -46470,14 +46754,14 @@
           <w:lang w:val="en-IN"/>
         </w:rPr>
       </w:pPr>
-      <w:bookmarkStart w:id="45" w:name="_Toc223365950"/>
+      <w:bookmarkStart w:id="46" w:name="_Toc223365950"/>
       <w:r>
         <w:rPr>
           <w:lang w:val="en-IN"/>
         </w:rPr>
         <w:t>8.6 Future-State Roadmap (AI Evolution)</w:t>
       </w:r>
-      <w:bookmarkEnd w:id="45"/>
+      <w:bookmarkEnd w:id="46"/>
     </w:p>
     <w:p>
       <w:pPr>
@@ -46603,8 +46887,6 @@
           <w:lang w:val="en-IN"/>
         </w:rPr>
       </w:pPr>
-      <w:bookmarkStart w:id="46" w:name="_GoBack"/>
-      <w:bookmarkEnd w:id="46"/>
       <w:r>
         <w:rPr>
           <w:b/>
@@ -46693,12 +46975,12 @@
       </w:pPr>
     </w:p>
     <w:sectPr>
-      <w:headerReference w:type="even" r:id="rId29"/>
-      <w:headerReference w:type="default" r:id="rId30"/>
-      <w:footerReference w:type="even" r:id="rId31"/>
-      <w:footerReference w:type="default" r:id="rId32"/>
-      <w:headerReference w:type="first" r:id="rId33"/>
-      <w:footerReference w:type="first" r:id="rId34"/>
+      <w:headerReference w:type="even" r:id="rId30"/>
+      <w:headerReference w:type="default" r:id="rId31"/>
+      <w:footerReference w:type="even" r:id="rId32"/>
+      <w:footerReference w:type="default" r:id="rId33"/>
+      <w:headerReference w:type="first" r:id="rId34"/>
+      <w:footerReference w:type="first" r:id="rId35"/>
       <w:pgSz w:w="11906" w:h="16838"/>
       <w:pgMar w:top="1417" w:right="1134" w:bottom="1134" w:left="1134" w:header="708" w:footer="708" w:gutter="0"/>
       <w:pgNumType w:start="0"/>
@@ -52501,7 +52783,7 @@
 </file>
 
 <file path=customXml/itemProps2.xml><?xml version="1.0" encoding="utf-8"?>
-<ds:datastoreItem xmlns:ds="http://schemas.openxmlformats.org/officeDocument/2006/customXml" ds:itemID="{6716CFC9-54D7-4853-AEDB-8141F84D2322}">
+<ds:datastoreItem xmlns:ds="http://schemas.openxmlformats.org/officeDocument/2006/customXml" ds:itemID="{86CC4D7A-549D-4C30-A78D-7F7E588C2C53}">
   <ds:schemaRefs>
     <ds:schemaRef ds:uri="http://schemas.openxmlformats.org/officeDocument/2006/bibliography"/>
   </ds:schemaRefs>

</xml_diff>